<commit_message>
feat: update report and demo
</commit_message>
<xml_diff>
--- a/docs/FFT-Project-Report-V1.docx
+++ b/docs/FFT-Project-Report-V1.docx
@@ -213,6 +213,7 @@
       </w:r>
       <w:r>
         <w:rPr>
+          <w:rtl/>
           <w:cs/>
         </w:rPr>
         <w:br/>
@@ -299,6 +300,84 @@
       </w:pPr>
       <w:r>
         <w:lastRenderedPageBreak/>
+        <w:t>FFT on whole audio vs short timeframe comparison</w:t>
+      </w:r>
+    </w:p>
+    <w:p>
+      <w:pPr>
+        <w:ind w:firstLine="0"/>
+      </w:pPr>
+      <w:r>
+        <w:drawing>
+          <wp:inline distT="0" distB="0" distL="0" distR="0" wp14:anchorId="4FD93860" wp14:editId="3103E8ED">
+            <wp:extent cx="5943600" cy="2355215"/>
+            <wp:effectExtent l="0" t="0" r="0" b="6985"/>
+            <wp:docPr id="3" name="Picture 3"/>
+            <wp:cNvGraphicFramePr>
+              <a:graphicFrameLocks xmlns:a="http://schemas.openxmlformats.org/drawingml/2006/main" noChangeAspect="1"/>
+            </wp:cNvGraphicFramePr>
+            <a:graphic xmlns:a="http://schemas.openxmlformats.org/drawingml/2006/main">
+              <a:graphicData uri="http://schemas.openxmlformats.org/drawingml/2006/picture">
+                <pic:pic xmlns:pic="http://schemas.openxmlformats.org/drawingml/2006/picture">
+                  <pic:nvPicPr>
+                    <pic:cNvPr id="1" name=""/>
+                    <pic:cNvPicPr/>
+                  </pic:nvPicPr>
+                  <pic:blipFill>
+                    <a:blip r:embed="rId10"/>
+                    <a:stretch>
+                      <a:fillRect/>
+                    </a:stretch>
+                  </pic:blipFill>
+                  <pic:spPr>
+                    <a:xfrm>
+                      <a:off x="0" y="0"/>
+                      <a:ext cx="5943600" cy="2355215"/>
+                    </a:xfrm>
+                    <a:prstGeom prst="rect">
+                      <a:avLst/>
+                    </a:prstGeom>
+                  </pic:spPr>
+                </pic:pic>
+              </a:graphicData>
+            </a:graphic>
+          </wp:inline>
+        </w:drawing>
+      </w:r>
+    </w:p>
+    <w:p>
+      <w:pPr>
+        <w:ind w:firstLine="0"/>
+      </w:pPr>
+      <w:r>
+        <w:t>By applying the FFT to a small, 30ms segment of audio rather than the whole signal, we gain significant clarity in the frequency domain</w:t>
+      </w:r>
+      <w:r>
+        <w:t xml:space="preserve">. There is </w:t>
+      </w:r>
+      <w:r>
+        <w:t>distinct peaks between 0 – 1000 Hz</w:t>
+      </w:r>
+      <w:r>
+        <w:t xml:space="preserve"> and the rest of signal above 1500 Hz </w:t>
+      </w:r>
+      <w:r>
+        <w:t xml:space="preserve">levels off significantly, resting at a magnitude of approximately 20 </w:t>
+      </w:r>
+      <w:proofErr w:type="spellStart"/>
+      <w:r>
+        <w:t>dB</w:t>
+      </w:r>
+      <w:r>
+        <w:t>.</w:t>
+      </w:r>
+      <w:proofErr w:type="spellEnd"/>
+    </w:p>
+    <w:p>
+      <w:pPr>
+        <w:ind w:firstLine="0"/>
+      </w:pPr>
+      <w:r>
         <w:t>STFT on noisy audio</w:t>
       </w:r>
     </w:p>
@@ -327,7 +406,7 @@
                     <pic:cNvPicPr/>
                   </pic:nvPicPr>
                   <pic:blipFill>
-                    <a:blip r:embed="rId10"/>
+                    <a:blip r:embed="rId11"/>
                     <a:stretch>
                       <a:fillRect/>
                     </a:stretch>
@@ -353,6 +432,7 @@
         <w:ind w:firstLine="0"/>
       </w:pPr>
       <w:r>
+        <w:lastRenderedPageBreak/>
         <w:tab/>
       </w:r>
       <w:r>
@@ -483,7 +563,6 @@
         <w:ind w:firstLine="0"/>
       </w:pPr>
       <w:r>
-        <w:lastRenderedPageBreak/>
         <w:t>Method 1: Spectral Subtraction &amp; Masking</w:t>
       </w:r>
       <w:r>
@@ -541,7 +620,11 @@
         <w:t>Result &amp; Trade-off: The initial binary approach produced significant "Musical Noise" (robotic chirps) because the binary "on/off" nature of the mask created jagged edges in the frequency domain. Adding the spectral floor ensured that background noise never dropped to zero, making the audio sound more natural and less "dead".</w:t>
       </w:r>
       <w:r>
-        <w:t xml:space="preserve"> However this method also assume that noise happened right in the beginning of the audio and stay more or less the same during the entire audio, so it might struggle on non-stationary noise such as engine noise etc.</w:t>
+        <w:t xml:space="preserve"> However this method also assume that noise happened right in the beginning of the audio and stay </w:t>
+      </w:r>
+      <w:r>
+        <w:lastRenderedPageBreak/>
+        <w:t>more or less the same during the entire audio, so it might struggle on non-stationary noise such as engine noise etc.</w:t>
       </w:r>
     </w:p>
     <w:p>
@@ -577,7 +660,7 @@
                     <pic:cNvPicPr/>
                   </pic:nvPicPr>
                   <pic:blipFill>
-                    <a:blip r:embed="rId11"/>
+                    <a:blip r:embed="rId12"/>
                     <a:stretch>
                       <a:fillRect/>
                     </a:stretch>
@@ -603,7 +686,6 @@
         <w:ind w:firstLine="0"/>
       </w:pPr>
       <w:r>
-        <w:lastRenderedPageBreak/>
         <w:t>We capture the first 0.1s of audio (assuming it is period before human start talking) as baseline for noise floor. During filtering, if the frequency of speech is not louder than noise, we will deem it a noise and reduced it.</w:t>
       </w:r>
     </w:p>
@@ -614,6 +696,22 @@
       <w:r>
         <w:t>Method 2: Wiener-Style Filtering</w:t>
       </w:r>
+      <w:r>
+        <w:t xml:space="preserve">: </w:t>
+      </w:r>
+      <w:r>
+        <w:t xml:space="preserve">Unlike Spectral Subtraction, which treats noise as a fixed value to be removed, Wiener-style filtering treats noise as a statistical </w:t>
+      </w:r>
+      <w:proofErr w:type="gramStart"/>
+      <w:r>
+        <w:t>probability</w:t>
+      </w:r>
+      <w:r>
+        <w:t>.</w:t>
+      </w:r>
+      <w:bookmarkStart w:id="0" w:name="_GoBack"/>
+      <w:bookmarkEnd w:id="0"/>
+      <w:proofErr w:type="gramEnd"/>
     </w:p>
     <w:p>
       <w:pPr>
@@ -682,6 +780,7 @@
         </w:numPr>
       </w:pPr>
       <w:r>
+        <w:lastRenderedPageBreak/>
         <w:t xml:space="preserve">Logic: Instead of taking a single noise snapshot at the beginning, the algorithm </w:t>
       </w:r>
       <w:r>
@@ -728,8 +827,6 @@
       <w:r>
         <w:t>.</w:t>
       </w:r>
-      <w:bookmarkStart w:id="0" w:name="_GoBack"/>
-      <w:bookmarkEnd w:id="0"/>
     </w:p>
     <w:p>
       <w:pPr>
@@ -790,7 +887,6 @@
         </w:numPr>
       </w:pPr>
       <w:r>
-        <w:lastRenderedPageBreak/>
         <w:t>STFT: The Short-Time Fourier Transform breaks the audio into a Spectrogram, revealing a map of frequencies over time.</w:t>
       </w:r>
     </w:p>
@@ -869,6 +965,7 @@
         </w:numPr>
       </w:pPr>
       <w:r>
+        <w:lastRenderedPageBreak/>
         <w:t>Beta (</w:t>
       </w:r>
       <w:r>
@@ -957,7 +1054,7 @@
                     <pic:cNvPicPr/>
                   </pic:nvPicPr>
                   <pic:blipFill>
-                    <a:blip r:embed="rId12"/>
+                    <a:blip r:embed="rId13"/>
                     <a:stretch>
                       <a:fillRect/>
                     </a:stretch>
@@ -980,7 +1077,6 @@
     </w:p>
     <w:p>
       <w:r>
-        <w:lastRenderedPageBreak/>
         <w:t>Note there is</w:t>
       </w:r>
       <w:r>
@@ -1016,6 +1112,7 @@
           <w:noProof/>
           <w:lang w:eastAsia="zh-CN" w:bidi="km-KH"/>
         </w:rPr>
+        <w:lastRenderedPageBreak/>
         <w:drawing>
           <wp:inline distT="0" distB="0" distL="0" distR="0" wp14:anchorId="41B09C90" wp14:editId="060F6572">
             <wp:extent cx="5943600" cy="2244725"/>
@@ -1032,7 +1129,7 @@
                     <pic:cNvPicPr/>
                   </pic:nvPicPr>
                   <pic:blipFill>
-                    <a:blip r:embed="rId13"/>
+                    <a:blip r:embed="rId14"/>
                     <a:stretch>
                       <a:fillRect/>
                     </a:stretch>
@@ -1135,7 +1232,6 @@
         </w:numPr>
       </w:pPr>
       <w:r>
-        <w:lastRenderedPageBreak/>
         <w:t xml:space="preserve">Limitation: While Short-Time </w:t>
       </w:r>
       <w:r>
@@ -1168,6 +1264,7 @@
     </w:p>
     <w:p>
       <w:r>
+        <w:lastRenderedPageBreak/>
         <w:t xml:space="preserve">By applying the FFT via the STFT pipeline, we successfully increased the Signal-to-Noise Ratio (SNR) of a speech recording. While FFT-based </w:t>
       </w:r>
       <w:proofErr w:type="spellStart"/>
@@ -1180,12 +1277,12 @@
       </w:r>
     </w:p>
     <w:sectPr>
-      <w:headerReference w:type="even" r:id="rId14"/>
-      <w:headerReference w:type="default" r:id="rId15"/>
-      <w:footerReference w:type="even" r:id="rId16"/>
-      <w:footerReference w:type="default" r:id="rId17"/>
-      <w:headerReference w:type="first" r:id="rId18"/>
-      <w:footerReference w:type="first" r:id="rId19"/>
+      <w:headerReference w:type="even" r:id="rId15"/>
+      <w:headerReference w:type="default" r:id="rId16"/>
+      <w:footerReference w:type="even" r:id="rId17"/>
+      <w:footerReference w:type="default" r:id="rId18"/>
+      <w:headerReference w:type="first" r:id="rId19"/>
+      <w:footerReference w:type="first" r:id="rId20"/>
       <w:pgSz w:w="12240" w:h="15840"/>
       <w:pgMar w:top="1440" w:right="1440" w:bottom="1440" w:left="1440" w:header="720" w:footer="720" w:gutter="0"/>
       <w:cols w:space="720"/>
@@ -1327,7 +1424,7 @@
       <w:rPr>
         <w:noProof/>
       </w:rPr>
-      <w:t>5</w:t>
+      <w:t>9</w:t>
     </w:r>
     <w:r>
       <w:rPr>
@@ -7123,6 +7220,7 @@
   <w:rsids>
     <w:rsidRoot w:val="001D44BA"/>
     <w:rsid w:val="001D44BA"/>
+    <w:rsid w:val="002567CD"/>
     <w:rsid w:val="002B53DC"/>
     <w:rsid w:val="002E1A2F"/>
     <w:rsid w:val="0038673B"/>
@@ -7923,7 +8021,7 @@
 </file>
 
 <file path=customXml/itemProps2.xml><?xml version="1.0" encoding="utf-8"?>
-<ds:datastoreItem xmlns:ds="http://schemas.openxmlformats.org/officeDocument/2006/customXml" ds:itemID="{136D0B1B-FC87-49C9-8B89-195498510A44}">
+<ds:datastoreItem xmlns:ds="http://schemas.openxmlformats.org/officeDocument/2006/customXml" ds:itemID="{1AF7C257-7DE8-459C-B165-AA873FDBEE49}">
   <ds:schemaRefs>
     <ds:schemaRef ds:uri="http://schemas.openxmlformats.org/officeDocument/2006/bibliography"/>
   </ds:schemaRefs>

</xml_diff>

<commit_message>
fix: update project docs
</commit_message>
<xml_diff>
--- a/docs/FFT-Project-Report-V1.docx
+++ b/docs/FFT-Project-Report-V1.docx
@@ -25,7 +25,10 @@
         <w:pStyle w:val="NoSpacing"/>
       </w:pPr>
       <w:r>
-        <w:t xml:space="preserve">Doctor. VENG </w:t>
+        <w:t>Dr</w:t>
+      </w:r>
+      <w:r>
+        <w:t xml:space="preserve">. VENG </w:t>
       </w:r>
       <w:proofErr w:type="spellStart"/>
       <w:r>
@@ -308,6 +311,10 @@
         <w:ind w:firstLine="0"/>
       </w:pPr>
       <w:r>
+        <w:rPr>
+          <w:noProof/>
+          <w:lang w:eastAsia="zh-CN" w:bidi="km-KH"/>
+        </w:rPr>
         <w:drawing>
           <wp:inline distT="0" distB="0" distL="0" distR="0" wp14:anchorId="4FD93860" wp14:editId="3103E8ED">
             <wp:extent cx="5943600" cy="2355215"/>
@@ -563,10 +570,13 @@
         <w:ind w:firstLine="0"/>
       </w:pPr>
       <w:r>
-        <w:t>Method 1: Spectral Subtraction &amp; Masking</w:t>
-      </w:r>
-      <w:r>
-        <w:t xml:space="preserve"> </w:t>
+        <w:t xml:space="preserve">Method 1: Spectral Subtraction </w:t>
+      </w:r>
+      <w:r>
+        <w:t xml:space="preserve">- </w:t>
+      </w:r>
+      <w:r>
+        <w:t>Fixed Noise Subtraction</w:t>
       </w:r>
     </w:p>
     <w:p>
@@ -735,12 +745,7 @@
         <w:t xml:space="preserve"> </w:t>
       </w:r>
       <w:r>
-        <w:t>If a frequency bin has high power compared to the noise floor, the gain is near 1.0 (passed through). If the power is low (</w:t>
-      </w:r>
-      <w:bookmarkStart w:id="0" w:name="_GoBack"/>
-      <w:bookmarkEnd w:id="0"/>
-      <w:r>
-        <w:t>likely noise), the gain drops toward 0.0 (suppressed)</w:t>
+        <w:t>If a frequency bin has high power compared to the noise floor, the gain is near 1.0 (passed through). If the power is low (likely noise), the gain drops toward 0.0 (suppressed)</w:t>
       </w:r>
     </w:p>
     <w:p>
@@ -764,7 +769,10 @@
       </w:pPr>
       <w:r>
         <w:lastRenderedPageBreak/>
-        <w:t xml:space="preserve">Method 3: Adaptive Median-Based </w:t>
+        <w:t>Method 3: A</w:t>
+      </w:r>
+      <w:r>
+        <w:t xml:space="preserve">daptive Median-Based </w:t>
       </w:r>
       <w:proofErr w:type="spellStart"/>
       <w:r>
@@ -772,8 +780,16 @@
       </w:r>
       <w:proofErr w:type="spellEnd"/>
       <w:r>
-        <w:t xml:space="preserve"> (Final Strategy)</w:t>
-      </w:r>
+        <w:t xml:space="preserve"> - </w:t>
+      </w:r>
+      <w:r>
+        <w:rPr>
+          <w:rStyle w:val="agcmg"/>
+        </w:rPr>
+        <w:t>Adaptive Median -Noise Subtraction</w:t>
+      </w:r>
+      <w:bookmarkStart w:id="0" w:name="_GoBack"/>
+      <w:bookmarkEnd w:id="0"/>
     </w:p>
     <w:p>
       <w:pPr>
@@ -1427,7 +1443,7 @@
       <w:rPr>
         <w:noProof/>
       </w:rPr>
-      <w:t>6</w:t>
+      <w:t>9</w:t>
     </w:r>
     <w:r>
       <w:rPr>
@@ -7038,6 +7054,11 @@
     <w:basedOn w:val="DefaultParagraphFont"/>
     <w:rsid w:val="00D33B6C"/>
   </w:style>
+  <w:style w:type="character" w:customStyle="1" w:styleId="agcmg">
+    <w:name w:val="a_gcmg"/>
+    <w:basedOn w:val="DefaultParagraphFont"/>
+    <w:rsid w:val="00AE308D"/>
+  </w:style>
 </w:styles>
 </file>
 
@@ -7222,6 +7243,7 @@
   </w:compat>
   <w:rsids>
     <w:rsidRoot w:val="001D44BA"/>
+    <w:rsid w:val="001910B4"/>
     <w:rsid w:val="001D44BA"/>
     <w:rsid w:val="002B53DC"/>
     <w:rsid w:val="002E1A2F"/>
@@ -8024,7 +8046,7 @@
 </file>
 
 <file path=customXml/itemProps2.xml><?xml version="1.0" encoding="utf-8"?>
-<ds:datastoreItem xmlns:ds="http://schemas.openxmlformats.org/officeDocument/2006/customXml" ds:itemID="{46E352A2-FCE0-45B2-BB87-A515B9318D41}">
+<ds:datastoreItem xmlns:ds="http://schemas.openxmlformats.org/officeDocument/2006/customXml" ds:itemID="{C91B46DE-F61F-445F-B396-F68D29EA1EA4}">
   <ds:schemaRefs>
     <ds:schemaRef ds:uri="http://schemas.openxmlformats.org/officeDocument/2006/bibliography"/>
   </ds:schemaRefs>

</xml_diff>